<commit_message>
add code stage point in the word file
</commit_message>
<xml_diff>
--- a/08_segragate_positive_and_negative_numbers/algorithm.docx
+++ b/08_segragate_positive_and_negative_numbers/algorithm.docx
@@ -408,27 +408,7 @@
           <w:sz w:val="32"/>
           <w:szCs w:val="32"/>
         </w:rPr>
-        <w:t xml:space="preserve">- Read the array (x) </w:t>
-      </w:r>
-      <w:proofErr w:type="gramStart"/>
-      <w:r>
-        <w:rPr>
-          <w:b/>
-          <w:bCs/>
-          <w:sz w:val="32"/>
-          <w:szCs w:val="32"/>
-        </w:rPr>
-        <w:t>start ,</w:t>
-      </w:r>
-      <w:proofErr w:type="gramEnd"/>
-      <w:r>
-        <w:rPr>
-          <w:b/>
-          <w:bCs/>
-          <w:sz w:val="32"/>
-          <w:szCs w:val="32"/>
-        </w:rPr>
-        <w:t xml:space="preserve"> end and index</w:t>
+        <w:t>- Read the array (x) start , end and index</w:t>
       </w:r>
     </w:p>
     <w:p>
@@ -662,6 +642,44 @@
     <w:p>
       <w:pPr>
         <w:bidi/>
+        <w:rPr>
+          <w:rFonts w:asciiTheme="majorBidi" w:hAnsiTheme="majorBidi" w:cstheme="majorBidi"/>
+          <w:sz w:val="36"/>
+          <w:szCs w:val="36"/>
+          <w:rtl/>
+          <w:lang w:bidi="ar-EG"/>
+        </w:rPr>
+      </w:pPr>
+    </w:p>
+    <w:p>
+      <w:pPr>
+        <w:bidi/>
+        <w:rPr>
+          <w:rFonts w:asciiTheme="majorBidi" w:hAnsiTheme="majorBidi" w:cstheme="majorBidi"/>
+          <w:sz w:val="36"/>
+          <w:szCs w:val="36"/>
+          <w:rtl/>
+          <w:lang w:bidi="ar-EG"/>
+        </w:rPr>
+      </w:pPr>
+      <w:r>
+        <w:rPr>
+          <w:rFonts w:asciiTheme="majorBidi" w:hAnsiTheme="majorBidi" w:cstheme="majorBidi" w:hint="cs"/>
+          <w:sz w:val="36"/>
+          <w:szCs w:val="36"/>
+          <w:rtl/>
+        </w:rPr>
+        <w:t xml:space="preserve">- الجزء الثاني اللي هو </w:t>
+      </w:r>
+      <w:r>
+        <w:rPr>
+          <w:rFonts w:asciiTheme="majorBidi" w:hAnsiTheme="majorBidi" w:cstheme="majorBidi"/>
+          <w:sz w:val="36"/>
+          <w:szCs w:val="36"/>
+        </w:rPr>
+        <w:t xml:space="preserve">merge </w:t>
+      </w:r>
+      <w:r>
         <w:rPr>
           <w:rFonts w:asciiTheme="majorBidi" w:hAnsiTheme="majorBidi" w:cstheme="majorBidi" w:hint="cs"/>
           <w:sz w:val="36"/>
@@ -669,11 +687,9 @@
           <w:rtl/>
           <w:lang w:bidi="ar-EG"/>
         </w:rPr>
-      </w:pPr>
-    </w:p>
-    <w:p>
-      <w:pPr>
-        <w:bidi/>
+        <w:t xml:space="preserve"> النقاط 1 </w:t>
+      </w:r>
+      <w:r>
         <w:rPr>
           <w:rFonts w:asciiTheme="majorBidi" w:hAnsiTheme="majorBidi" w:cstheme="majorBidi"/>
           <w:sz w:val="36"/>
@@ -681,23 +697,7 @@
           <w:rtl/>
           <w:lang w:bidi="ar-EG"/>
         </w:rPr>
-      </w:pPr>
-      <w:r>
-        <w:rPr>
-          <w:rFonts w:asciiTheme="majorBidi" w:hAnsiTheme="majorBidi" w:cstheme="majorBidi" w:hint="cs"/>
-          <w:sz w:val="36"/>
-          <w:szCs w:val="36"/>
-          <w:rtl/>
-        </w:rPr>
-        <w:t xml:space="preserve">- الجزء الثاني اللي هو </w:t>
-      </w:r>
-      <w:r>
-        <w:rPr>
-          <w:rFonts w:asciiTheme="majorBidi" w:hAnsiTheme="majorBidi" w:cstheme="majorBidi"/>
-          <w:sz w:val="36"/>
-          <w:szCs w:val="36"/>
-        </w:rPr>
-        <w:t xml:space="preserve">merge </w:t>
+        <w:t>–</w:t>
       </w:r>
       <w:r>
         <w:rPr>
@@ -707,26 +707,6 @@
           <w:rtl/>
           <w:lang w:bidi="ar-EG"/>
         </w:rPr>
-        <w:t xml:space="preserve"> النقاط 1 </w:t>
-      </w:r>
-      <w:r>
-        <w:rPr>
-          <w:rFonts w:asciiTheme="majorBidi" w:hAnsiTheme="majorBidi" w:cstheme="majorBidi"/>
-          <w:sz w:val="36"/>
-          <w:szCs w:val="36"/>
-          <w:rtl/>
-          <w:lang w:bidi="ar-EG"/>
-        </w:rPr>
-        <w:t>–</w:t>
-      </w:r>
-      <w:r>
-        <w:rPr>
-          <w:rFonts w:asciiTheme="majorBidi" w:hAnsiTheme="majorBidi" w:cstheme="majorBidi" w:hint="cs"/>
-          <w:sz w:val="36"/>
-          <w:szCs w:val="36"/>
-          <w:rtl/>
-          <w:lang w:bidi="ar-EG"/>
-        </w:rPr>
         <w:t xml:space="preserve"> 2 -4 زي ما هما</w:t>
       </w:r>
     </w:p>
@@ -1245,12 +1225,19 @@
           <w:szCs w:val="32"/>
         </w:rPr>
       </w:pPr>
+      <w:r>
+        <w:rPr>
+          <w:sz w:val="32"/>
+          <w:szCs w:val="32"/>
+        </w:rPr>
+        <w:t xml:space="preserve">- Code Stage </w:t>
+      </w:r>
     </w:p>
     <w:p>
       <w:pPr>
         <w:bidi/>
         <w:rPr>
-          <w:rFonts w:asciiTheme="majorBidi" w:hAnsiTheme="majorBidi" w:cstheme="majorBidi" w:hint="cs"/>
+          <w:rFonts w:asciiTheme="majorBidi" w:hAnsiTheme="majorBidi" w:cstheme="majorBidi"/>
           <w:sz w:val="36"/>
           <w:szCs w:val="36"/>
           <w:rtl/>

</xml_diff>